<commit_message>
docs: status Finalizada, agrupamento automático e tabela user_log
- monografia, manual, casos de teste e fluxos: exclusão lógica (Finalizada),
  agrupamento automático sem alerta, apoio como curtida e "Concluída" no lugar
  de "Atendida"; histórico mantido na versão 1.16
- apêndice D: tabela user_log no dicionário e no DER; DDL e DML do modelo
  físico atualizados
- apêndice J: bateria de 368 testes e caso CT48
</commit_message>
<xml_diff>
--- a/ApêndiceA-GestãodoProjeto/FalaCidade_GestaoDoProjeto_v4.docx
+++ b/ApêndiceA-GestãodoProjeto/FalaCidade_GestaoDoProjeto_v4.docx
@@ -18,28 +18,39 @@
           <w:sz w:val="24"/>
           <w:szCs w:val="24"/>
         </w:rPr>
-        <w:t xml:space="preserve">FAI – CENTRO DE ENSINO </w:t>
+        <w:t xml:space="preserve">FAI – CENTRO DE ENSINO SUPERIOR EM GESTÃO, TECNOLOGIA E EDUCAÇÃO</w:t>
       </w:r>
+    </w:p>
+    <w:p>
+      <w:pPr>
+        <w:pStyle w:val="1627"/>
+        <w:pBdr/>
+        <w:spacing/>
+        <w:ind/>
+        <w:rPr>
+          <w:sz w:val="24"/>
+          <w:szCs w:val="24"/>
+        </w:rPr>
+      </w:pPr>
       <w:r>
         <w:rPr>
           <w:sz w:val="24"/>
           <w:szCs w:val="24"/>
         </w:rPr>
-        <w:t xml:space="preserve">SUPERIOR EM GESTÃO, TECNOLOGIA </w:t>
+        <w:t xml:space="preserve">CURSO DE SISTEMAS DE INFORMAÇÃO</w:t>
       </w:r>
-      <w:r>
+    </w:p>
+    <w:p>
+      <w:pPr>
+        <w:pStyle w:val="1627"/>
+        <w:pBdr/>
+        <w:spacing/>
+        <w:ind/>
         <w:rPr>
           <w:sz w:val="24"/>
           <w:szCs w:val="24"/>
         </w:rPr>
-        <w:t xml:space="preserve">E EDUCAÇÃO</w:t>
-      </w:r>
-      <w:r>
-        <w:rPr>
-          <w:sz w:val="24"/>
-          <w:szCs w:val="24"/>
-        </w:rPr>
-      </w:r>
+      </w:pPr>
       <w:r>
         <w:rPr>
           <w:sz w:val="24"/>
@@ -63,14 +74,58 @@
           <w:sz w:val="24"/>
           <w:szCs w:val="24"/>
         </w:rPr>
-        <w:t xml:space="preserve">CURSO DE SISTEMAS DE INFORMAÇÃO</w:t>
+        <w:t xml:space="preserve">LUCAS FIORRIGI FURLAN</w:t>
       </w:r>
+    </w:p>
+    <w:p>
+      <w:pPr>
+        <w:pStyle w:val="1627"/>
+        <w:pBdr/>
+        <w:spacing/>
+        <w:ind/>
+        <w:rPr>
+          <w:sz w:val="24"/>
+          <w:szCs w:val="24"/>
+        </w:rPr>
+      </w:pPr>
       <w:r>
         <w:rPr>
           <w:sz w:val="24"/>
           <w:szCs w:val="24"/>
         </w:rPr>
+        <w:t xml:space="preserve">MIGUEL MARTINS LIMA</w:t>
       </w:r>
+    </w:p>
+    <w:p>
+      <w:pPr>
+        <w:pStyle w:val="1627"/>
+        <w:pBdr/>
+        <w:spacing/>
+        <w:ind/>
+        <w:rPr>
+          <w:sz w:val="24"/>
+          <w:szCs w:val="24"/>
+        </w:rPr>
+      </w:pPr>
+      <w:r>
+        <w:rPr>
+          <w:sz w:val="24"/>
+          <w:szCs w:val="24"/>
+        </w:rPr>
+        <w:t xml:space="preserve">RODRIGO PEREIRA ROMANO</w:t>
+      </w:r>
+    </w:p>
+    <w:p>
+      <w:pPr>
+        <w:pStyle w:val="1627"/>
+        <w:pBdr/>
+        <w:spacing/>
+        <w:ind/>
+        <w:rPr>
+          <w:sz w:val="24"/>
+          <w:szCs w:val="24"/>
+        </w:rPr>
+      </w:pPr>
       <w:r>
         <w:rPr>
           <w:sz w:val="24"/>
@@ -95,12 +150,18 @@
           <w:szCs w:val="24"/>
         </w:rPr>
       </w:r>
-      <w:r>
+    </w:p>
+    <w:p>
+      <w:pPr>
+        <w:pStyle w:val="1627"/>
+        <w:pBdr/>
+        <w:spacing/>
+        <w:ind/>
         <w:rPr>
           <w:sz w:val="24"/>
           <w:szCs w:val="24"/>
         </w:rPr>
-      </w:r>
+      </w:pPr>
       <w:r>
         <w:rPr>
           <w:sz w:val="24"/>
@@ -124,14 +185,19 @@
           <w:sz w:val="24"/>
           <w:szCs w:val="24"/>
         </w:rPr>
-        <w:t xml:space="preserve">LUCAS FIORRIGI FURLAN</w:t>
       </w:r>
-      <w:r>
+    </w:p>
+    <w:p>
+      <w:pPr>
+        <w:pStyle w:val="1627"/>
+        <w:pBdr/>
+        <w:spacing/>
+        <w:ind/>
         <w:rPr>
           <w:sz w:val="24"/>
           <w:szCs w:val="24"/>
         </w:rPr>
-      </w:r>
+      </w:pPr>
       <w:r>
         <w:rPr>
           <w:sz w:val="24"/>
@@ -155,14 +221,68 @@
           <w:sz w:val="24"/>
           <w:szCs w:val="24"/>
         </w:rPr>
-        <w:t xml:space="preserve">MIGUEL MARTINS LIMA</w:t>
       </w:r>
+    </w:p>
+    <w:p>
+      <w:pPr>
+        <w:pStyle w:val="1627"/>
+        <w:pBdr/>
+        <w:spacing/>
+        <w:ind/>
+        <w:rPr>
+          <w:sz w:val="24"/>
+          <w:szCs w:val="24"/>
+        </w:rPr>
+      </w:pPr>
       <w:r>
         <w:rPr>
           <w:sz w:val="24"/>
           <w:szCs w:val="24"/>
         </w:rPr>
+        <w:t xml:space="preserve">SISTEMA DE INFORMAÇÃO PARA REPORTE DE OCORRÊNCIAS E APOIO À GESTÃO DE ZELADORIA PÚBLICA: FALA, CIDADE!</w:t>
       </w:r>
+    </w:p>
+    <w:p>
+      <w:pPr>
+        <w:pBdr/>
+        <w:spacing/>
+        <w:ind/>
+        <w:rPr>
+          <w:szCs w:val="24"/>
+        </w:rPr>
+      </w:pPr>
+      <w:r>
+        <w:rPr>
+          <w:szCs w:val="24"/>
+        </w:rPr>
+      </w:r>
+    </w:p>
+    <w:p>
+      <w:pPr>
+        <w:pBdr/>
+        <w:spacing/>
+        <w:ind/>
+        <w:rPr>
+          <w:szCs w:val="24"/>
+        </w:rPr>
+      </w:pPr>
+      <w:r>
+        <w:rPr>
+          <w:szCs w:val="24"/>
+        </w:rPr>
+      </w:r>
+    </w:p>
+    <w:p>
+      <w:pPr>
+        <w:pStyle w:val="1627"/>
+        <w:pBdr/>
+        <w:spacing/>
+        <w:ind/>
+        <w:rPr>
+          <w:sz w:val="24"/>
+          <w:szCs w:val="24"/>
+        </w:rPr>
+      </w:pPr>
       <w:r>
         <w:rPr>
           <w:sz w:val="24"/>
@@ -186,14 +306,19 @@
           <w:sz w:val="24"/>
           <w:szCs w:val="24"/>
         </w:rPr>
-        <w:t xml:space="preserve">RODRIGO PEREIRA ROMANO</w:t>
       </w:r>
-      <w:r>
+    </w:p>
+    <w:p>
+      <w:pPr>
+        <w:pStyle w:val="1627"/>
+        <w:pBdr/>
+        <w:spacing/>
+        <w:ind/>
         <w:rPr>
           <w:sz w:val="24"/>
           <w:szCs w:val="24"/>
         </w:rPr>
-      </w:r>
+      </w:pPr>
       <w:r>
         <w:rPr>
           <w:sz w:val="24"/>
@@ -218,12 +343,18 @@
           <w:szCs w:val="24"/>
         </w:rPr>
       </w:r>
-      <w:r>
+    </w:p>
+    <w:p>
+      <w:pPr>
+        <w:pStyle w:val="1627"/>
+        <w:pBdr/>
+        <w:spacing/>
+        <w:ind/>
         <w:rPr>
           <w:sz w:val="24"/>
           <w:szCs w:val="24"/>
         </w:rPr>
-      </w:r>
+      </w:pPr>
       <w:r>
         <w:rPr>
           <w:sz w:val="24"/>
@@ -248,481 +379,43 @@
           <w:szCs w:val="24"/>
         </w:rPr>
       </w:r>
+    </w:p>
+    <w:p>
+      <w:pPr>
+        <w:pStyle w:val="1627"/>
+        <w:pBdr/>
+        <w:spacing/>
+        <w:ind/>
+        <w:rPr>
+          <w:sz w:val="24"/>
+          <w:szCs w:val="24"/>
+        </w:rPr>
+      </w:pPr>
       <w:r>
         <w:rPr>
           <w:sz w:val="24"/>
           <w:szCs w:val="24"/>
         </w:rPr>
+        <w:t xml:space="preserve">SANTA RITA DO SAPUCAÍ - MG</w:t>
       </w:r>
+    </w:p>
+    <w:p>
+      <w:pPr>
+        <w:pStyle w:val="1627"/>
+        <w:pBdr/>
+        <w:spacing/>
+        <w:ind/>
+        <w:rPr>
+          <w:sz w:val="24"/>
+          <w:szCs w:val="24"/>
+        </w:rPr>
+      </w:pPr>
       <w:r>
         <w:rPr>
           <w:sz w:val="24"/>
           <w:szCs w:val="24"/>
         </w:rPr>
-      </w:r>
-    </w:p>
-    <w:p>
-      <w:pPr>
-        <w:pStyle w:val="1627"/>
-        <w:pBdr/>
-        <w:spacing/>
-        <w:ind/>
-        <w:rPr>
-          <w:sz w:val="24"/>
-          <w:szCs w:val="24"/>
-        </w:rPr>
-      </w:pPr>
-      <w:r>
-        <w:rPr>
-          <w:sz w:val="24"/>
-          <w:szCs w:val="24"/>
-        </w:rPr>
-      </w:r>
-      <w:r>
-        <w:rPr>
-          <w:sz w:val="24"/>
-          <w:szCs w:val="24"/>
-        </w:rPr>
-      </w:r>
-      <w:r>
-        <w:rPr>
-          <w:sz w:val="24"/>
-          <w:szCs w:val="24"/>
-        </w:rPr>
-      </w:r>
-    </w:p>
-    <w:p>
-      <w:pPr>
-        <w:pStyle w:val="1627"/>
-        <w:pBdr/>
-        <w:spacing/>
-        <w:ind/>
-        <w:rPr>
-          <w:sz w:val="24"/>
-          <w:szCs w:val="24"/>
-        </w:rPr>
-      </w:pPr>
-      <w:r>
-        <w:rPr>
-          <w:sz w:val="24"/>
-          <w:szCs w:val="24"/>
-        </w:rPr>
-      </w:r>
-      <w:r>
-        <w:rPr>
-          <w:sz w:val="24"/>
-          <w:szCs w:val="24"/>
-        </w:rPr>
-      </w:r>
-      <w:r>
-        <w:rPr>
-          <w:sz w:val="24"/>
-          <w:szCs w:val="24"/>
-        </w:rPr>
-      </w:r>
-    </w:p>
-    <w:p>
-      <w:pPr>
-        <w:pStyle w:val="1627"/>
-        <w:pBdr/>
-        <w:spacing/>
-        <w:ind/>
-        <w:rPr>
-          <w:sz w:val="24"/>
-          <w:szCs w:val="24"/>
-        </w:rPr>
-      </w:pPr>
-      <w:r>
-        <w:rPr>
-          <w:sz w:val="24"/>
-          <w:szCs w:val="24"/>
-        </w:rPr>
-      </w:r>
-      <w:r>
-        <w:rPr>
-          <w:sz w:val="24"/>
-          <w:szCs w:val="24"/>
-        </w:rPr>
-      </w:r>
-      <w:r>
-        <w:rPr>
-          <w:sz w:val="24"/>
-          <w:szCs w:val="24"/>
-        </w:rPr>
-      </w:r>
-    </w:p>
-    <w:p>
-      <w:pPr>
-        <w:pStyle w:val="1627"/>
-        <w:pBdr/>
-        <w:spacing/>
-        <w:ind/>
-        <w:rPr>
-          <w:sz w:val="24"/>
-          <w:szCs w:val="24"/>
-        </w:rPr>
-      </w:pPr>
-      <w:r>
-        <w:rPr>
-          <w:sz w:val="24"/>
-          <w:szCs w:val="24"/>
-        </w:rPr>
-      </w:r>
-      <w:r>
-        <w:rPr>
-          <w:sz w:val="24"/>
-          <w:szCs w:val="24"/>
-        </w:rPr>
-      </w:r>
-      <w:r>
-        <w:rPr>
-          <w:sz w:val="24"/>
-          <w:szCs w:val="24"/>
-        </w:rPr>
-      </w:r>
-    </w:p>
-    <w:p>
-      <w:pPr>
-        <w:pStyle w:val="1627"/>
-        <w:pBdr/>
-        <w:spacing/>
-        <w:ind/>
-        <w:rPr>
-          <w:sz w:val="24"/>
-          <w:szCs w:val="24"/>
-        </w:rPr>
-      </w:pPr>
-      <w:r>
-        <w:rPr>
-          <w:sz w:val="24"/>
-          <w:szCs w:val="24"/>
-        </w:rPr>
-        <w:t xml:space="preserve">SISTEMA DE INFORMAÇÃO PARA REPORTE DE OCORRÊNCIAS E APOIO À GESTÃO DE ZELADORIA PÚBLICA: FALA, CIDADE!</w:t>
-      </w:r>
-      <w:r>
-        <w:rPr>
-          <w:sz w:val="24"/>
-          <w:szCs w:val="24"/>
-        </w:rPr>
-      </w:r>
-      <w:r>
-        <w:rPr>
-          <w:sz w:val="24"/>
-          <w:szCs w:val="24"/>
-        </w:rPr>
-      </w:r>
-    </w:p>
-    <w:p>
-      <w:pPr>
-        <w:pBdr/>
-        <w:spacing/>
-        <w:ind/>
-        <w:rPr>
-          <w:szCs w:val="24"/>
-        </w:rPr>
-      </w:pPr>
-      <w:r>
-        <w:rPr>
-          <w:szCs w:val="24"/>
-        </w:rPr>
-      </w:r>
-      <w:r>
-        <w:rPr>
-          <w:szCs w:val="24"/>
-        </w:rPr>
-      </w:r>
-      <w:r>
-        <w:rPr>
-          <w:szCs w:val="24"/>
-        </w:rPr>
-      </w:r>
-    </w:p>
-    <w:p>
-      <w:pPr>
-        <w:pBdr/>
-        <w:spacing/>
-        <w:ind/>
-        <w:rPr>
-          <w:szCs w:val="24"/>
-        </w:rPr>
-      </w:pPr>
-      <w:r>
-        <w:rPr>
-          <w:szCs w:val="24"/>
-        </w:rPr>
-      </w:r>
-      <w:r>
-        <w:rPr>
-          <w:szCs w:val="24"/>
-        </w:rPr>
-      </w:r>
-      <w:r>
-        <w:rPr>
-          <w:szCs w:val="24"/>
-        </w:rPr>
-      </w:r>
-    </w:p>
-    <w:p>
-      <w:pPr>
-        <w:pStyle w:val="1627"/>
-        <w:pBdr/>
-        <w:spacing/>
-        <w:ind/>
-        <w:rPr>
-          <w:sz w:val="24"/>
-          <w:szCs w:val="24"/>
-        </w:rPr>
-      </w:pPr>
-      <w:r>
-        <w:rPr>
-          <w:sz w:val="24"/>
-          <w:szCs w:val="24"/>
-        </w:rPr>
-      </w:r>
-      <w:r>
-        <w:rPr>
-          <w:sz w:val="24"/>
-          <w:szCs w:val="24"/>
-        </w:rPr>
-      </w:r>
-      <w:r>
-        <w:rPr>
-          <w:sz w:val="24"/>
-          <w:szCs w:val="24"/>
-        </w:rPr>
-      </w:r>
-    </w:p>
-    <w:p>
-      <w:pPr>
-        <w:pStyle w:val="1627"/>
-        <w:pBdr/>
-        <w:spacing/>
-        <w:ind/>
-        <w:rPr>
-          <w:sz w:val="24"/>
-          <w:szCs w:val="24"/>
-        </w:rPr>
-      </w:pPr>
-      <w:r>
-        <w:rPr>
-          <w:sz w:val="24"/>
-          <w:szCs w:val="24"/>
-        </w:rPr>
-      </w:r>
-      <w:r>
-        <w:rPr>
-          <w:sz w:val="24"/>
-          <w:szCs w:val="24"/>
-        </w:rPr>
-      </w:r>
-      <w:r>
-        <w:rPr>
-          <w:sz w:val="24"/>
-          <w:szCs w:val="24"/>
-        </w:rPr>
-      </w:r>
-    </w:p>
-    <w:p>
-      <w:pPr>
-        <w:pStyle w:val="1627"/>
-        <w:pBdr/>
-        <w:spacing/>
-        <w:ind/>
-        <w:rPr>
-          <w:sz w:val="24"/>
-          <w:szCs w:val="24"/>
-        </w:rPr>
-      </w:pPr>
-      <w:r>
-        <w:rPr>
-          <w:sz w:val="24"/>
-          <w:szCs w:val="24"/>
-        </w:rPr>
-      </w:r>
-      <w:r>
-        <w:rPr>
-          <w:sz w:val="24"/>
-          <w:szCs w:val="24"/>
-        </w:rPr>
-      </w:r>
-      <w:r>
-        <w:rPr>
-          <w:sz w:val="24"/>
-          <w:szCs w:val="24"/>
-        </w:rPr>
-      </w:r>
-    </w:p>
-    <w:p>
-      <w:pPr>
-        <w:pStyle w:val="1627"/>
-        <w:pBdr/>
-        <w:spacing/>
-        <w:ind/>
-        <w:rPr>
-          <w:sz w:val="24"/>
-          <w:szCs w:val="24"/>
-        </w:rPr>
-      </w:pPr>
-      <w:r>
-        <w:rPr>
-          <w:sz w:val="24"/>
-          <w:szCs w:val="24"/>
-        </w:rPr>
-      </w:r>
-      <w:r>
-        <w:rPr>
-          <w:sz w:val="24"/>
-          <w:szCs w:val="24"/>
-        </w:rPr>
-      </w:r>
-      <w:r>
-        <w:rPr>
-          <w:sz w:val="24"/>
-          <w:szCs w:val="24"/>
-        </w:rPr>
-      </w:r>
-    </w:p>
-    <w:p>
-      <w:pPr>
-        <w:pStyle w:val="1627"/>
-        <w:pBdr/>
-        <w:spacing/>
-        <w:ind/>
-        <w:rPr>
-          <w:sz w:val="24"/>
-          <w:szCs w:val="24"/>
-        </w:rPr>
-      </w:pPr>
-      <w:r>
-        <w:rPr>
-          <w:sz w:val="24"/>
-          <w:szCs w:val="24"/>
-        </w:rPr>
-      </w:r>
-      <w:r>
-        <w:rPr>
-          <w:sz w:val="24"/>
-          <w:szCs w:val="24"/>
-        </w:rPr>
-      </w:r>
-      <w:r>
-        <w:rPr>
-          <w:sz w:val="24"/>
-          <w:szCs w:val="24"/>
-        </w:rPr>
-      </w:r>
-    </w:p>
-    <w:p>
-      <w:pPr>
-        <w:pStyle w:val="1627"/>
-        <w:pBdr/>
-        <w:spacing/>
-        <w:ind/>
-        <w:rPr>
-          <w:sz w:val="24"/>
-          <w:szCs w:val="24"/>
-        </w:rPr>
-      </w:pPr>
-      <w:r>
-        <w:rPr>
-          <w:sz w:val="24"/>
-          <w:szCs w:val="24"/>
-        </w:rPr>
-      </w:r>
-      <w:r>
-        <w:rPr>
-          <w:sz w:val="24"/>
-          <w:szCs w:val="24"/>
-        </w:rPr>
-      </w:r>
-      <w:r>
-        <w:rPr>
-          <w:sz w:val="24"/>
-          <w:szCs w:val="24"/>
-        </w:rPr>
-      </w:r>
-    </w:p>
-    <w:p>
-      <w:pPr>
-        <w:pStyle w:val="1627"/>
-        <w:pBdr/>
-        <w:spacing/>
-        <w:ind/>
-        <w:rPr>
-          <w:sz w:val="24"/>
-          <w:szCs w:val="24"/>
-        </w:rPr>
-      </w:pPr>
-      <w:r>
-        <w:rPr>
-          <w:sz w:val="24"/>
-          <w:szCs w:val="24"/>
-        </w:rPr>
-        <w:t xml:space="preserve">S</w:t>
-      </w:r>
-      <w:r>
-        <w:rPr>
-          <w:sz w:val="24"/>
-          <w:szCs w:val="24"/>
-        </w:rPr>
-        <w:t xml:space="preserve">ANTA RITA DO SAPUCAÍ - MG</w:t>
-      </w:r>
-      <w:r>
-        <w:rPr>
-          <w:sz w:val="24"/>
-          <w:szCs w:val="24"/>
-        </w:rPr>
-      </w:r>
-      <w:r>
-        <w:rPr>
-          <w:sz w:val="24"/>
-          <w:szCs w:val="24"/>
-        </w:rPr>
-      </w:r>
-    </w:p>
-    <w:p>
-      <w:pPr>
-        <w:pStyle w:val="1627"/>
-        <w:pBdr/>
-        <w:spacing/>
-        <w:ind/>
-        <w:rPr>
-          <w:sz w:val="24"/>
-          <w:szCs w:val="24"/>
-        </w:rPr>
-      </w:pPr>
-      <w:r>
-        <w:rPr>
-          <w:sz w:val="24"/>
-          <w:szCs w:val="24"/>
-        </w:rPr>
-        <w:t xml:space="preserve">20</w:t>
-      </w:r>
-      <w:r>
-        <w:rPr>
-          <w:sz w:val="24"/>
-          <w:szCs w:val="24"/>
-        </w:rPr>
-        <w:t xml:space="preserve">2</w:t>
-      </w:r>
-      <w:r>
-        <w:rPr>
-          <w:sz w:val="24"/>
-          <w:szCs w:val="24"/>
-        </w:rPr>
-        <w:t xml:space="preserve">6</w:t>
-      </w:r>
-      <w:r>
-        <w:rPr>
-          <w:sz w:val="24"/>
-          <w:szCs w:val="24"/>
-        </w:rPr>
-      </w:r>
-      <w:r>
-        <w:rPr>
-          <w:sz w:val="24"/>
-          <w:szCs w:val="24"/>
-        </w:rPr>
+        <w:t xml:space="preserve">2026</w:t>
       </w:r>
     </w:p>
     <w:p>
@@ -744,11 +437,17 @@
           <w:szCs w:val="20"/>
         </w:rPr>
       </w:r>
+    </w:p>
+    <w:p>
+      <w:pPr>
+        <w:pStyle w:val="1626"/>
+        <w:pBdr/>
+        <w:spacing/>
+        <w:ind/>
+        <w:rPr/>
+      </w:pPr>
       <w:r>
-        <w:rPr>
-          <w:sz w:val="28"/>
-          <w:szCs w:val="20"/>
-        </w:rPr>
+        <w:t xml:space="preserve">SUMÁRIO</w:t>
       </w:r>
     </w:p>
     <w:p>
@@ -759,20 +458,6 @@
         <w:ind/>
         <w:rPr/>
       </w:pPr>
-      <w:r>
-        <w:t xml:space="preserve">SUMÁRIO</w:t>
-      </w:r>
-      <w:r/>
-    </w:p>
-    <w:p>
-      <w:pPr>
-        <w:pStyle w:val="1626"/>
-        <w:pBdr/>
-        <w:spacing/>
-        <w:ind/>
-        <w:rPr/>
-      </w:pPr>
-      <w:r/>
       <w:r/>
     </w:p>
     <w:sdt>
@@ -800,7 +485,6 @@
             <w:rPr/>
           </w:pPr>
           <w:r/>
-          <w:r/>
         </w:p>
         <w:p>
           <w:pPr>
@@ -818,17 +502,7 @@
               <w:bCs/>
             </w:rPr>
             <w:fldChar w:fldCharType="begin"/>
-          </w:r>
-          <w:r>
-            <w:rPr>
-              <w:bCs/>
-            </w:rPr>
             <w:instrText xml:space="preserve"> TOC \o "1-3" \h \z \u </w:instrText>
-          </w:r>
-          <w:r>
-            <w:rPr>
-              <w:bCs/>
-            </w:rPr>
             <w:fldChar w:fldCharType="separate"/>
           </w:r>
           <w:r/>
@@ -837,22 +511,10 @@
               <w:rPr>
                 <w:rStyle w:val="1624"/>
               </w:rPr>
-            </w:r>
-            <w:r>
-              <w:rPr>
-                <w:rStyle w:val="1624"/>
-              </w:rPr>
               <w:t xml:space="preserve">1 GESTÃO DO PROJETO</w:t>
             </w:r>
             <w:r>
-              <w:rPr>
-                <w:rStyle w:val="1624"/>
-              </w:rPr>
-            </w:r>
-            <w:r>
               <w:tab/>
-            </w:r>
-            <w:r>
               <w:fldChar w:fldCharType="begin"/>
               <w:instrText xml:space="preserve">PAGEREF _Toc1 \h</w:instrText>
               <w:fldChar w:fldCharType="separate"/>
@@ -878,22 +540,10 @@
               <w:rPr>
                 <w:rStyle w:val="1624"/>
               </w:rPr>
-            </w:r>
-            <w:r>
-              <w:rPr>
-                <w:rStyle w:val="1624"/>
-              </w:rPr>
               <w:t xml:space="preserve">1.1 PRODUCT BACKLOG</w:t>
             </w:r>
             <w:r>
-              <w:rPr>
-                <w:rStyle w:val="1624"/>
-              </w:rPr>
-            </w:r>
-            <w:r>
               <w:tab/>
-            </w:r>
-            <w:r>
               <w:fldChar w:fldCharType="begin"/>
               <w:instrText xml:space="preserve">PAGEREF _Toc2 \h</w:instrText>
               <w:fldChar w:fldCharType="separate"/>
@@ -919,22 +569,10 @@
               <w:rPr>
                 <w:rStyle w:val="1624"/>
               </w:rPr>
-            </w:r>
-            <w:r>
-              <w:rPr>
-                <w:rStyle w:val="1624"/>
-              </w:rPr>
               <w:t xml:space="preserve">1.2 ESTRUTURA ANALÍTICA DO PROJETO (EAP)</w:t>
             </w:r>
             <w:r>
-              <w:rPr>
-                <w:rStyle w:val="1624"/>
-              </w:rPr>
-            </w:r>
-            <w:r>
               <w:tab/>
-            </w:r>
-            <w:r>
               <w:fldChar w:fldCharType="begin"/>
               <w:instrText xml:space="preserve">PAGEREF _Toc3 \h</w:instrText>
               <w:fldChar w:fldCharType="separate"/>
@@ -960,22 +598,10 @@
               <w:rPr>
                 <w:rStyle w:val="1624"/>
               </w:rPr>
-            </w:r>
-            <w:r>
-              <w:rPr>
-                <w:rStyle w:val="1624"/>
-              </w:rPr>
               <w:t xml:space="preserve">1.3 CRONOGRAMA</w:t>
             </w:r>
             <w:r>
-              <w:rPr>
-                <w:rStyle w:val="1624"/>
-              </w:rPr>
-            </w:r>
-            <w:r>
               <w:tab/>
-            </w:r>
-            <w:r>
               <w:fldChar w:fldCharType="begin"/>
               <w:instrText xml:space="preserve">PAGEREF _Toc4 \h</w:instrText>
               <w:fldChar w:fldCharType="separate"/>
@@ -1001,22 +627,10 @@
               <w:rPr>
                 <w:rStyle w:val="1624"/>
               </w:rPr>
-            </w:r>
-            <w:r>
-              <w:rPr>
-                <w:rStyle w:val="1624"/>
-              </w:rPr>
               <w:t xml:space="preserve">1.3.1 Concepção e Planejamento (Fase 1)</w:t>
             </w:r>
             <w:r>
-              <w:rPr>
-                <w:rStyle w:val="1624"/>
-              </w:rPr>
-            </w:r>
-            <w:r>
               <w:tab/>
-            </w:r>
-            <w:r>
               <w:fldChar w:fldCharType="begin"/>
               <w:instrText xml:space="preserve">PAGEREF _Toc5 \h</w:instrText>
               <w:fldChar w:fldCharType="separate"/>
@@ -1042,22 +656,10 @@
               <w:rPr>
                 <w:rStyle w:val="1624"/>
               </w:rPr>
-            </w:r>
-            <w:r>
-              <w:rPr>
-                <w:rStyle w:val="1624"/>
-              </w:rPr>
               <w:t xml:space="preserve">1.3.2 Desenvolvimento e Testes do Back-end (Fase 2 e Fase 3)</w:t>
             </w:r>
             <w:r>
-              <w:rPr>
-                <w:rStyle w:val="1624"/>
-              </w:rPr>
-            </w:r>
-            <w:r>
               <w:tab/>
-            </w:r>
-            <w:r>
               <w:fldChar w:fldCharType="begin"/>
               <w:instrText xml:space="preserve">PAGEREF _Toc6 \h</w:instrText>
               <w:fldChar w:fldCharType="separate"/>
@@ -1083,22 +685,10 @@
               <w:rPr>
                 <w:rStyle w:val="1624"/>
               </w:rPr>
-            </w:r>
-            <w:r>
-              <w:rPr>
-                <w:rStyle w:val="1624"/>
-              </w:rPr>
               <w:t xml:space="preserve">1.3.3 Desenvolvimento e Testes do Front-end</w:t>
             </w:r>
             <w:r>
-              <w:rPr>
-                <w:rStyle w:val="1624"/>
-              </w:rPr>
-            </w:r>
-            <w:r>
               <w:tab/>
-            </w:r>
-            <w:r>
               <w:fldChar w:fldCharType="begin"/>
               <w:instrText xml:space="preserve">PAGEREF _Toc7 \h</w:instrText>
               <w:fldChar w:fldCharType="separate"/>
@@ -1124,22 +714,10 @@
               <w:rPr>
                 <w:rStyle w:val="1624"/>
               </w:rPr>
-            </w:r>
-            <w:r>
-              <w:rPr>
-                <w:rStyle w:val="1624"/>
-              </w:rPr>
               <w:t xml:space="preserve">1.3.4 Validação e Correções</w:t>
             </w:r>
             <w:r>
-              <w:rPr>
-                <w:rStyle w:val="1624"/>
-              </w:rPr>
-            </w:r>
-            <w:r>
               <w:tab/>
-            </w:r>
-            <w:r>
               <w:fldChar w:fldCharType="begin"/>
               <w:instrText xml:space="preserve">PAGEREF _Toc8 \h</w:instrText>
               <w:fldChar w:fldCharType="separate"/>
@@ -1165,22 +743,10 @@
               <w:rPr>
                 <w:rStyle w:val="1624"/>
               </w:rPr>
-            </w:r>
-            <w:r>
-              <w:rPr>
-                <w:rStyle w:val="1624"/>
-              </w:rPr>
               <w:t xml:space="preserve">1.3.5 Fase 3 — Arquitetura, Implementação e Testes</w:t>
             </w:r>
             <w:r>
-              <w:rPr>
-                <w:rStyle w:val="1624"/>
-              </w:rPr>
-            </w:r>
-            <w:r>
               <w:tab/>
-            </w:r>
-            <w:r>
               <w:fldChar w:fldCharType="begin"/>
               <w:instrText xml:space="preserve">PAGEREF _Toc9 \h</w:instrText>
               <w:fldChar w:fldCharType="separate"/>
@@ -1206,22 +772,10 @@
               <w:rPr>
                 <w:rStyle w:val="1624"/>
               </w:rPr>
-            </w:r>
-            <w:r>
-              <w:rPr>
-                <w:rStyle w:val="1624"/>
-              </w:rPr>
               <w:t xml:space="preserve">1.3.6 Fase 4 — Implantação, Encerramento e Defesa</w:t>
             </w:r>
             <w:r>
-              <w:rPr>
-                <w:rStyle w:val="1624"/>
-              </w:rPr>
-            </w:r>
-            <w:r>
               <w:tab/>
-            </w:r>
-            <w:r>
               <w:fldChar w:fldCharType="begin"/>
               <w:instrText xml:space="preserve">PAGEREF _Toc10 \h</w:instrText>
               <w:fldChar w:fldCharType="separate"/>
@@ -1247,22 +801,10 @@
               <w:rPr>
                 <w:rStyle w:val="1624"/>
               </w:rPr>
-            </w:r>
-            <w:r>
-              <w:rPr>
-                <w:rStyle w:val="1624"/>
-              </w:rPr>
               <w:t xml:space="preserve">1.4 CAMINHO CRÍTICO</w:t>
             </w:r>
             <w:r>
-              <w:rPr>
-                <w:rStyle w:val="1624"/>
-              </w:rPr>
-            </w:r>
-            <w:r>
               <w:tab/>
-            </w:r>
-            <w:r>
               <w:fldChar w:fldCharType="begin"/>
               <w:instrText xml:space="preserve">PAGEREF _Toc11 \h</w:instrText>
               <w:fldChar w:fldCharType="separate"/>
@@ -1288,22 +830,10 @@
               <w:rPr>
                 <w:rStyle w:val="1624"/>
               </w:rPr>
-            </w:r>
-            <w:r>
-              <w:rPr>
-                <w:rStyle w:val="1624"/>
-              </w:rPr>
               <w:t xml:space="preserve">1.5 MARCOS DO PROJETO</w:t>
             </w:r>
             <w:r>
-              <w:rPr>
-                <w:rStyle w:val="1624"/>
-              </w:rPr>
-            </w:r>
-            <w:r>
               <w:tab/>
-            </w:r>
-            <w:r>
               <w:fldChar w:fldCharType="begin"/>
               <w:instrText xml:space="preserve">PAGEREF _Toc12 \h</w:instrText>
               <w:fldChar w:fldCharType="separate"/>
@@ -1329,22 +859,10 @@
               <w:rPr>
                 <w:rStyle w:val="1624"/>
               </w:rPr>
-            </w:r>
-            <w:r>
-              <w:rPr>
-                <w:rStyle w:val="1624"/>
-              </w:rPr>
               <w:t xml:space="preserve">1.6 GESTÃO DE RISCOS</w:t>
             </w:r>
             <w:r>
-              <w:rPr>
-                <w:rStyle w:val="1624"/>
-              </w:rPr>
-            </w:r>
-            <w:r>
               <w:tab/>
-            </w:r>
-            <w:r>
               <w:fldChar w:fldCharType="begin"/>
               <w:instrText xml:space="preserve">PAGEREF _Toc13 \h</w:instrText>
               <w:fldChar w:fldCharType="separate"/>
@@ -1370,22 +888,10 @@
               <w:rPr>
                 <w:rStyle w:val="1624"/>
               </w:rPr>
-            </w:r>
-            <w:r>
-              <w:rPr>
-                <w:rStyle w:val="1624"/>
-              </w:rPr>
               <w:t xml:space="preserve">1.7 PAPÉIS E RESPONSABILIDADES</w:t>
             </w:r>
             <w:r>
-              <w:rPr>
-                <w:rStyle w:val="1624"/>
-              </w:rPr>
-            </w:r>
-            <w:r>
               <w:tab/>
-            </w:r>
-            <w:r>
               <w:fldChar w:fldCharType="begin"/>
               <w:instrText xml:space="preserve">PAGEREF _Toc14 \h</w:instrText>
               <w:fldChar w:fldCharType="separate"/>
@@ -1415,7 +921,6 @@
             <w:fldChar w:fldCharType="end"/>
           </w:r>
           <w:r/>
-          <w:r/>
         </w:p>
       </w:sdtContent>
     </w:sdt>
@@ -1440,7 +945,6 @@
         </w:sectPr>
       </w:pPr>
       <w:r/>
-      <w:r/>
     </w:p>
     <w:p>
       <w:pPr>
@@ -1457,7 +961,6 @@
       </w:r>
       <w:bookmarkEnd w:id="1"/>
       <w:r/>
-      <w:r/>
     </w:p>
     <w:p>
       <w:pPr>
@@ -1470,13 +973,7 @@
         <w:rPr>
           <w:b w:val="0"/>
         </w:rPr>
-        <w:t xml:space="preserve">Este documento consolida os artefatos de gerenciamento do projeto “Fala, Cidade!” — product backlog, estrutura analítica do projeto, cronograma, caminho crítico, marcos e gestão de riscos </w:t>
-      </w:r>
-      <w:r>
-        <w:rPr>
-          <w:b w:val="0"/>
-        </w:rPr>
-        <w:t xml:space="preserve">— e substitui a versão 3, elaborada ao término da Fase 2. A presente versão incorpora os marcos das Fases 3 e 4, conforme o planejamento da disciplina de Projeto Final de Curso II, e a gestão de riscos desenvolvida na disciplina de Gerência de Projetos II.</w:t>
+        <w:t xml:space="preserve">Este documento consolida os artefatos de gerenciamento do projeto “Fala, Cidade!” — product backlog, estrutura analítica do projeto, cronograma, caminho crítico, marcos e gestão de riscos — e substitui a versão 3, elaborada ao término da Fase 2. A presente versão incorpora os marcos das Fases 3 e 4, conforme o planejamento da disciplina de Projeto Final de Curso II, e a gestão de riscos desenvolvida na disciplina de Gerência de Projetos II.</w:t>
       </w:r>
       <w:r/>
     </w:p>
@@ -1921,7 +1418,6 @@
       <w:r>
         <w:t xml:space="preserve">QUADRO 1 – Histórico de revisões deste documento</w:t>
       </w:r>
-      <w:r/>
     </w:p>
     <w:p>
       <w:pPr>
@@ -1937,7 +1433,6 @@
         <w:t xml:space="preserve">1.1 PRODUCT BACKLOG</w:t>
       </w:r>
       <w:bookmarkEnd w:id="2"/>
-      <w:r/>
       <w:r/>
     </w:p>
     <w:p>
@@ -3105,7 +2600,7 @@
               <w:rPr>
                 <w:sz w:val="20"/>
               </w:rPr>
-              <w:t xml:space="preserve">Alerta e agrupamento de duplicidade em raio de cinquenta metros</w:t>
+              <w:t xml:space="preserve">Agrupamento automático de duplicidade em raio de cinquenta metros</w:t>
             </w:r>
             <w:r/>
           </w:p>
@@ -3531,7 +3026,6 @@
       <w:r>
         <w:t xml:space="preserve">QUADRO 2 – Product backlog do projeto</w:t>
       </w:r>
-      <w:r/>
     </w:p>
     <w:p>
       <w:pPr>
@@ -3547,7 +3041,6 @@
         <w:t xml:space="preserve">1.2 ESTRUTURA ANALÍTICA DO PROJETO (EAP)</w:t>
       </w:r>
       <w:bookmarkEnd w:id="3"/>
-      <w:r/>
       <w:r/>
     </w:p>
     <w:p>
@@ -3642,7 +3135,6 @@
           </mc:Fallback>
         </mc:AlternateContent>
       </w:r>
-      <w:r/>
     </w:p>
     <w:p>
       <w:pPr>
@@ -3656,7 +3148,6 @@
       <w:r>
         <w:t xml:space="preserve">FIGURA 1 – Estrutura Analítica do Projeto (EAP)</w:t>
       </w:r>
-      <w:r/>
     </w:p>
     <w:p>
       <w:pPr>
@@ -3688,7 +3179,6 @@
       </w:r>
       <w:bookmarkEnd w:id="4"/>
       <w:r/>
-      <w:r/>
     </w:p>
     <w:p>
       <w:pPr>
@@ -3719,7 +3209,6 @@
         <w:t xml:space="preserve">1.3.1 Concepção e Planejamento (Fase 1)</w:t>
       </w:r>
       <w:bookmarkEnd w:id="5"/>
-      <w:r/>
       <w:r/>
     </w:p>
     <w:tbl>
@@ -4431,7 +3920,6 @@
       <w:r>
         <w:t xml:space="preserve">QUADRO 3 – Cronograma da Fase 1</w:t>
       </w:r>
-      <w:r/>
     </w:p>
     <w:p>
       <w:pPr>
@@ -4447,7 +3935,6 @@
         <w:t xml:space="preserve">1.3.2 Desenvolvimento e Testes do Back-end (Fase 2 e Fase 3)</w:t>
       </w:r>
       <w:bookmarkEnd w:id="6"/>
-      <w:r/>
       <w:r/>
     </w:p>
     <w:tbl>
@@ -4933,7 +4420,6 @@
       <w:r>
         <w:t xml:space="preserve">QUADRO 4 – Cronograma do desenvolvimento do back-end</w:t>
       </w:r>
-      <w:r/>
     </w:p>
     <w:p>
       <w:pPr>
@@ -4949,7 +4435,6 @@
         <w:t xml:space="preserve">1.3.3 Desenvolvimento e Testes do Front-end</w:t>
       </w:r>
       <w:bookmarkEnd w:id="7"/>
-      <w:r/>
       <w:r/>
     </w:p>
     <w:tbl>
@@ -5435,7 +4920,6 @@
       <w:r>
         <w:t xml:space="preserve">QUADRO 5 – Cronograma do desenvolvimento do front-end</w:t>
       </w:r>
-      <w:r/>
     </w:p>
     <w:p>
       <w:pPr>
@@ -5451,7 +4935,6 @@
         <w:t xml:space="preserve">1.3.4 Validação e Correções</w:t>
       </w:r>
       <w:bookmarkEnd w:id="8"/>
-      <w:r/>
       <w:r/>
     </w:p>
     <w:tbl>
@@ -5824,7 +5307,6 @@
       <w:r>
         <w:t xml:space="preserve">QUADRO 6 – Cronograma da validação</w:t>
       </w:r>
-      <w:r/>
     </w:p>
     <w:p>
       <w:pPr>
@@ -5840,7 +5322,6 @@
         <w:t xml:space="preserve">1.3.5 Fase 3 — Arquitetura, Implementação e Testes</w:t>
       </w:r>
       <w:bookmarkEnd w:id="9"/>
-      <w:r/>
       <w:r/>
     </w:p>
     <w:tbl>
@@ -7117,7 +6598,6 @@
       <w:r>
         <w:t xml:space="preserve">QUADRO 7 – Cronograma da Fase 3</w:t>
       </w:r>
-      <w:r/>
     </w:p>
     <w:p>
       <w:pPr>
@@ -7133,7 +6613,6 @@
         <w:t xml:space="preserve">1.3.6 Fase 4 — Implantação, Encerramento e Defesa</w:t>
       </w:r>
       <w:bookmarkEnd w:id="10"/>
-      <w:r/>
       <w:r/>
     </w:p>
     <w:tbl>
@@ -8975,7 +8454,6 @@
       <w:r>
         <w:t xml:space="preserve">QUADRO 8 – Cronograma da Fase 4</w:t>
       </w:r>
-      <w:r/>
     </w:p>
     <w:p>
       <w:pPr>
@@ -8991,7 +8469,6 @@
         <w:t xml:space="preserve">1.4 CAMINHO CRÍTICO</w:t>
       </w:r>
       <w:bookmarkEnd w:id="11"/>
-      <w:r/>
       <w:r/>
     </w:p>
     <w:p>
@@ -9020,7 +8497,6 @@
       <w:r>
         <w:t xml:space="preserve">a) definição do tema e do escopo (5 dias);</w:t>
       </w:r>
-      <w:r/>
     </w:p>
     <w:p>
       <w:pPr>
@@ -9033,7 +8509,6 @@
       <w:r>
         <w:t xml:space="preserve">b) levantamento e definição dos requisitos (5 dias);</w:t>
       </w:r>
-      <w:r/>
     </w:p>
     <w:p>
       <w:pPr>
@@ -9046,7 +8521,6 @@
       <w:r>
         <w:t xml:space="preserve">c) protótipos das telas (7 dias);</w:t>
       </w:r>
-      <w:r/>
     </w:p>
     <w:p>
       <w:pPr>
@@ -9059,7 +8533,6 @@
       <w:r>
         <w:t xml:space="preserve">d) modelagem do banco de dados (5 dias);</w:t>
       </w:r>
-      <w:r/>
     </w:p>
     <w:p>
       <w:pPr>
@@ -9072,7 +8545,6 @@
       <w:r>
         <w:t xml:space="preserve">e) cadastro de usuários e testes integrados (9 dias);</w:t>
       </w:r>
-      <w:r/>
     </w:p>
     <w:p>
       <w:pPr>
@@ -9085,7 +8557,6 @@
       <w:r>
         <w:t xml:space="preserve">f) sistema de ocorrências e testes integrados (11 dias);</w:t>
       </w:r>
-      <w:r/>
     </w:p>
     <w:p>
       <w:pPr>
@@ -9098,7 +8569,6 @@
       <w:r>
         <w:t xml:space="preserve">g) sistema de acompanhamento e testes integrados (9 dias);</w:t>
       </w:r>
-      <w:r/>
     </w:p>
     <w:p>
       <w:pPr>
@@ -9111,7 +8581,6 @@
       <w:r>
         <w:t xml:space="preserve">h) painel administrativo e testes integrados (8 dias);</w:t>
       </w:r>
-      <w:r/>
     </w:p>
     <w:p>
       <w:pPr>
@@ -9124,7 +8593,6 @@
       <w:r>
         <w:t xml:space="preserve">i) integração e correção de defeitos globais (7 dias);</w:t>
       </w:r>
-      <w:r/>
     </w:p>
     <w:p>
       <w:pPr>
@@ -9137,7 +8605,6 @@
       <w:r>
         <w:t xml:space="preserve">j) validação final do sistema (4 dias);</w:t>
       </w:r>
-      <w:r/>
     </w:p>
     <w:p>
       <w:pPr>
@@ -9150,7 +8617,6 @@
       <w:r>
         <w:t xml:space="preserve">k) implementação das funcionalidades remanescentes da Fase 3 (20 dias);</w:t>
       </w:r>
-      <w:r/>
     </w:p>
     <w:p>
       <w:pPr>
@@ -9163,7 +8629,6 @@
       <w:r>
         <w:t xml:space="preserve">l) execução da bateria de testes unitários automatizados (8 dias);</w:t>
       </w:r>
-      <w:r/>
     </w:p>
     <w:p>
       <w:pPr>
@@ -9176,7 +8641,6 @@
       <w:r>
         <w:t xml:space="preserve">m) publicação do sistema (4 dias);</w:t>
       </w:r>
-      <w:r/>
     </w:p>
     <w:p>
       <w:pPr>
@@ -9189,7 +8653,6 @@
       <w:r>
         <w:t xml:space="preserve">n) apresentação na FAITEC 2026 (3 dias);</w:t>
       </w:r>
-      <w:r/>
     </w:p>
     <w:p>
       <w:pPr>
@@ -9202,7 +8665,6 @@
       <w:r>
         <w:t xml:space="preserve">o) entrega do projeto, do vídeo e dos slides à banca (1 dia);</w:t>
       </w:r>
-      <w:r/>
     </w:p>
     <w:p>
       <w:pPr>
@@ -9215,7 +8677,6 @@
       <w:r>
         <w:t xml:space="preserve">p) defesa perante a banca examinadora final (5 dias).</w:t>
       </w:r>
-      <w:r/>
     </w:p>
     <w:p>
       <w:pPr>
@@ -9231,7 +8692,6 @@
         <w:t xml:space="preserve">1.5 MARCOS DO PROJETO</w:t>
       </w:r>
       <w:bookmarkEnd w:id="12"/>
-      <w:r/>
       <w:r/>
     </w:p>
     <w:tbl>
@@ -10810,7 +10270,6 @@
       <w:r>
         <w:t xml:space="preserve">QUADRO 9 – Marcos do projeto e situação ao término da Fase 3</w:t>
       </w:r>
-      <w:r/>
     </w:p>
     <w:p>
       <w:pPr>
@@ -10827,7 +10286,6 @@
       </w:r>
       <w:bookmarkEnd w:id="13"/>
       <w:r/>
-      <w:r/>
     </w:p>
     <w:p>
       <w:pPr>
@@ -10840,13 +10298,7 @@
         <w:rPr>
           <w:b w:val="0"/>
         </w:rPr>
-        <w:t xml:space="preserve">A gestão de riscos do projeto, desenvolvida na disciplina de Gerência </w:t>
-      </w:r>
-      <w:r>
-        <w:rPr>
-          <w:b w:val="0"/>
-        </w:rPr>
-        <w:t xml:space="preserve">de Projetos II, compreende a identificação apoiada em matriz SWOT, a análise por probabilidade e impacto, o plano de resposta e o monitoramento contínuo. Foram registrados nove riscos negativos (R1 a R9) e seis riscos positivos, ou oportunidades (O1 a O6).</w:t>
+        <w:t xml:space="preserve">A gestão de riscos do projeto, desenvolvida na disciplina de Gerência de Projetos II, compreende a identificação apoiada em matriz SWOT, a análise por probabilidade e impacto, o plano de resposta e o monitoramento contínuo. Foram registrados nove riscos negativos (R1 a R9) e seis riscos positivos, ou oportunidades (O1 a O6).</w:t>
       </w:r>
       <w:r/>
     </w:p>
@@ -10876,7 +10328,6 @@
       <w:r>
         <w:t xml:space="preserve">a) FalaCidade_RelatorioGestaoRiscos_v1.docx — relatório completo, com a análise SWOT, a matriz de probabilidade × impacto, os riscos críticos e o plano de resposta;</w:t>
       </w:r>
-      <w:r/>
     </w:p>
     <w:p>
       <w:pPr>
@@ -10889,7 +10340,6 @@
       <w:r>
         <w:t xml:space="preserve">b) FalaCidade_PlanilhaGestaoRiscos_v1.xlsx — planilha de controle, com os riscos negativos e positivos, a exposição calculada, as estratégias, os responsáveis, os indicadores e a situação de cada risco.</w:t>
       </w:r>
-      <w:r/>
     </w:p>
     <w:p>
       <w:pPr>
@@ -10902,13 +10352,7 @@
         <w:rPr>
           <w:b w:val="0"/>
         </w:rPr>
-        <w:t xml:space="preserve">Os quatro riscos que ocupam a zona crítica da matriz — R1 (indisponibilidade dos serviços externos gratuitos), R2 (sobreposição do cronograma com as demais disciplinas), R4 (exposição de credenciais) e R5 (</w:t>
-      </w:r>
-      <w:r>
-        <w:rPr>
-          <w:b w:val="0"/>
-        </w:rPr>
-        <w:t xml:space="preserve">concentração do conhecimento da camada de persistência) — são objeto de reunião semanal de acompanhamento até a apresentação na FAITEC 2026. A matriz é revista ao término de cada sprint, durante a Sprint Retrospective, com registro na planilha de controle.</w:t>
+        <w:t xml:space="preserve">Os quatro riscos que ocupam a zona crítica da matriz — R1 (indisponibilidade dos serviços externos gratuitos), R2 (sobreposição do cronograma com as demais disciplinas), R4 (exposição de credenciais) e R5 (concentração do conhecimento da camada de persistência) — são objeto de reunião semanal de acompanhamento até a apresentação na FAITEC 2026. A matriz é revista ao término de cada sprint, durante a Sprint Retrospective, com registro na planilha de controle.</w:t>
       </w:r>
       <w:r/>
     </w:p>
@@ -10926,7 +10370,6 @@
         <w:t xml:space="preserve">1.7 PAPÉIS E RESPONSABILIDADES</w:t>
       </w:r>
       <w:bookmarkEnd w:id="14"/>
-      <w:r/>
       <w:r/>
     </w:p>
     <w:tbl>
@@ -11145,13 +10588,7 @@
               <w:rPr>
                 <w:sz w:val="20"/>
               </w:rPr>
-              <w:t xml:space="preserve">Levantamento e especificação de requisitos; modelagem UML; plano e execução dos testes; revisão cruzada do código do back-end; implementaç</w:t>
-            </w:r>
-            <w:r>
-              <w:rPr>
-                <w:sz w:val="20"/>
-              </w:rPr>
-              <w:t xml:space="preserve">ão do </w:t>
+              <w:t xml:space="preserve">Levantamento e especificação de requisitos; modelagem UML; plano e execução dos testes; revisão cruzada do código do back-end; implementação do </w:t>
             </w:r>
             <w:r/>
           </w:p>
@@ -11238,7 +10675,6 @@
       <w:r>
         <w:t xml:space="preserve">QUADRO 10 – Papéis e responsabilidades da equipe</w:t>
       </w:r>
-      <w:r/>
     </w:p>
     <w:sectPr>
       <w:headerReference w:type="default" r:id="rId11"/>

</xml_diff>